<commit_message>
feat(019): ВКР population — demo секция 3.5 GSPO (pandoc OMML pipeline доказан)
chapters/03-5_gspo.md (LaTeX формулы) -> assemble_vkr -> 19 OMML в .docx,
placeholder убран, каркас цел. Полный pandoc-гибрид работает.

Co-Authored-By: Claude Opus 4.7 (1M context) <noreply@anthropic.com>
</commit_message>
<xml_diff>
--- a/docs/diploma/ВКР_Сухацкий_2026.docx
+++ b/docs/diploma/ВКР_Сухацкий_2026.docx
@@ -1715,13 +1715,1072 @@
       </w:r>
     </w:p>
     <w:p>
-      <w:pPr/>
+      <w:pPr>
+        <w:pStyle w:val="FirstParagraph"/>
+      </w:pPr>
+      <w:r>
+        <w:t xml:space="preserve">Первая стадия дообучения реализует алгоритм Group Sequence Policy Optimization (GSPO) — расширение Group Relative Policy Optimization (GRPO) с переносом importance sampling на уровень последовательности. Для каждого учебного запроса генерируется группа из</w:t>
+      </w:r>
+      <w:r>
+        <w:t xml:space="preserve"> </w:t>
+      </w:r>
+      <m:oMath>
+        <m:r>
+          <m:t>G</m:t>
+        </m:r>
+      </m:oMath>
+      <w:r>
+        <w:t xml:space="preserve"> </w:t>
+      </w:r>
+      <w:r>
+        <w:t xml:space="preserve">траекторий, после чего вычисляется преимущество (advantage) как нормированное отклонение награды от среднего по группе:</w:t>
+      </w:r>
+    </w:p>
+    <w:p>
+      <w:pPr>
+        <w:pStyle w:val="a7"/>
+      </w:pPr>
+      <m:oMathPara>
+        <m:oMathParaPr>
+          <m:jc m:val="center"/>
+        </m:oMathParaPr>
+        <m:oMath>
+          <m:sSub>
+            <m:e>
+              <m:acc>
+                <m:accPr>
+                  <m:chr m:val="̂"/>
+                </m:accPr>
+                <m:e>
+                  <m:r>
+                    <m:t>A</m:t>
+                  </m:r>
+                </m:e>
+              </m:acc>
+            </m:e>
+            <m:sub>
+              <m:r>
+                <m:t>i</m:t>
+              </m:r>
+            </m:sub>
+          </m:sSub>
+          <m:r>
+            <m:rPr>
+              <m:sty m:val="p"/>
+            </m:rPr>
+            <m:t>=</m:t>
+          </m:r>
+          <m:f>
+            <m:fPr>
+              <m:type m:val="bar"/>
+            </m:fPr>
+            <m:num>
+              <m:sSub>
+                <m:e>
+                  <m:r>
+                    <m:t>r</m:t>
+                  </m:r>
+                </m:e>
+                <m:sub>
+                  <m:r>
+                    <m:t>i</m:t>
+                  </m:r>
+                </m:sub>
+              </m:sSub>
+              <m:r>
+                <m:rPr>
+                  <m:sty m:val="p"/>
+                </m:rPr>
+                <m:t>−</m:t>
+              </m:r>
+              <m:r>
+                <m:rPr>
+                  <m:sty m:val="p"/>
+                </m:rPr>
+                <m:t>mean</m:t>
+              </m:r>
+              <m:r>
+                <m:rPr>
+                  <m:sty m:val="p"/>
+                </m:rPr>
+                <m:t>(</m:t>
+              </m:r>
+              <m:sSub>
+                <m:e>
+                  <m:r>
+                    <m:t>r</m:t>
+                  </m:r>
+                </m:e>
+                <m:sub>
+                  <m:r>
+                    <m:t>1</m:t>
+                  </m:r>
+                </m:sub>
+              </m:sSub>
+              <m:r>
+                <m:rPr>
+                  <m:sty m:val="p"/>
+                </m:rPr>
+                <m:t>,</m:t>
+              </m:r>
+              <m:r>
+                <m:rPr>
+                  <m:sty m:val="p"/>
+                </m:rPr>
+                <m:t>…</m:t>
+              </m:r>
+              <m:r>
+                <m:rPr>
+                  <m:sty m:val="p"/>
+                </m:rPr>
+                <m:t>,</m:t>
+              </m:r>
+              <m:sSub>
+                <m:e>
+                  <m:r>
+                    <m:t>r</m:t>
+                  </m:r>
+                </m:e>
+                <m:sub>
+                  <m:r>
+                    <m:t>G</m:t>
+                  </m:r>
+                </m:sub>
+              </m:sSub>
+              <m:r>
+                <m:rPr>
+                  <m:sty m:val="p"/>
+                </m:rPr>
+                <m:t>)</m:t>
+              </m:r>
+            </m:num>
+            <m:den>
+              <m:r>
+                <m:rPr>
+                  <m:sty m:val="p"/>
+                </m:rPr>
+                <m:t>std</m:t>
+              </m:r>
+              <m:r>
+                <m:rPr>
+                  <m:sty m:val="p"/>
+                </m:rPr>
+                <m:t>(</m:t>
+              </m:r>
+              <m:sSub>
+                <m:e>
+                  <m:r>
+                    <m:t>r</m:t>
+                  </m:r>
+                </m:e>
+                <m:sub>
+                  <m:r>
+                    <m:t>1</m:t>
+                  </m:r>
+                </m:sub>
+              </m:sSub>
+              <m:r>
+                <m:rPr>
+                  <m:sty m:val="p"/>
+                </m:rPr>
+                <m:t>,</m:t>
+              </m:r>
+              <m:r>
+                <m:rPr>
+                  <m:sty m:val="p"/>
+                </m:rPr>
+                <m:t>…</m:t>
+              </m:r>
+              <m:r>
+                <m:rPr>
+                  <m:sty m:val="p"/>
+                </m:rPr>
+                <m:t>,</m:t>
+              </m:r>
+              <m:sSub>
+                <m:e>
+                  <m:r>
+                    <m:t>r</m:t>
+                  </m:r>
+                </m:e>
+                <m:sub>
+                  <m:r>
+                    <m:t>G</m:t>
+                  </m:r>
+                </m:sub>
+              </m:sSub>
+              <m:r>
+                <m:rPr>
+                  <m:sty m:val="p"/>
+                </m:rPr>
+                <m:t>)</m:t>
+              </m:r>
+            </m:den>
+          </m:f>
+          <m:r>
+            <m:rPr>
+              <m:sty m:val="p"/>
+            </m:rPr>
+            <m:t>.</m:t>
+          </m:r>
+        </m:oMath>
+      </m:oMathPara>
+    </w:p>
+    <w:p>
+      <w:pPr>
+        <w:pStyle w:val="FirstParagraph"/>
+      </w:pPr>
+      <w:r>
+        <w:t xml:space="preserve">В отличие от token-level importance sampling в GRPO, GSPO применяет отношение правдоподобий на уровне всей последовательности, что снижает дисперсию градиента при длинных цепочках рассуждений. Коэффициент клиппирования при этом задаётся на два-три порядка меньше token-level значения (</w:t>
+      </w:r>
+      <m:oMath>
+        <m:r>
+          <m:t>ε</m:t>
+        </m:r>
+        <m:r>
+          <m:rPr>
+            <m:sty m:val="p"/>
+          </m:rPr>
+          <m:t>≈</m:t>
+        </m:r>
+        <m:r>
+          <m:t>3</m:t>
+        </m:r>
+        <m:r>
+          <m:rPr>
+            <m:sty m:val="p"/>
+          </m:rPr>
+          <m:t>⋅</m:t>
+        </m:r>
+        <m:sSup>
+          <m:e>
+            <m:r>
+              <m:t>10</m:t>
+            </m:r>
+          </m:e>
+          <m:sup>
+            <m:r>
+              <m:rPr>
+                <m:sty m:val="p"/>
+              </m:rPr>
+              <m:t>−</m:t>
+            </m:r>
+            <m:r>
+              <m:t>4</m:t>
+            </m:r>
+          </m:sup>
+        </m:sSup>
+      </m:oMath>
+      <w:r>
+        <w:t xml:space="preserve"> </w:t>
+      </w:r>
+      <w:r>
+        <w:t xml:space="preserve">против</w:t>
+      </w:r>
+      <w:r>
+        <w:t xml:space="preserve"> </w:t>
+      </w:r>
+      <m:oMath>
+        <m:r>
+          <m:t>0</m:t>
+        </m:r>
+        <m:r>
+          <m:rPr>
+            <m:sty m:val="p"/>
+          </m:rPr>
+          <m:t>,</m:t>
+        </m:r>
+        <m:r>
+          <m:t>2</m:t>
+        </m:r>
+      </m:oMath>
+      <w:r>
+        <w:t xml:space="preserve">).</w:t>
+      </w:r>
+    </w:p>
+    <w:p>
+      <w:pPr>
+        <w:pStyle w:val="a7"/>
+      </w:pPr>
+      <w:r>
+        <w:t xml:space="preserve">Награда формируется как взвешенная комбинация трёх компонентов с GDPO-нормировкой (decoupled-нормализация каждого компонента до взвешивания):</w:t>
+      </w:r>
+    </w:p>
+    <w:p>
+      <w:pPr>
+        <w:pStyle w:val="a7"/>
+      </w:pPr>
+      <m:oMathPara>
+        <m:oMathParaPr>
+          <m:jc m:val="center"/>
+        </m:oMathParaPr>
+        <m:oMath>
+          <m:r>
+            <m:t>R</m:t>
+          </m:r>
+          <m:r>
+            <m:rPr>
+              <m:sty m:val="p"/>
+            </m:rPr>
+            <m:t>=</m:t>
+          </m:r>
+          <m:r>
+            <m:t>0</m:t>
+          </m:r>
+          <m:r>
+            <m:rPr>
+              <m:sty m:val="p"/>
+            </m:rPr>
+            <m:t>,</m:t>
+          </m:r>
+          <m:r>
+            <m:t>7</m:t>
+          </m:r>
+          <m:r>
+            <m:rPr>
+              <m:sty m:val="p"/>
+            </m:rPr>
+            <m:t>⋅</m:t>
+          </m:r>
+          <m:sSub>
+            <m:e>
+              <m:r>
+                <m:t>r</m:t>
+              </m:r>
+            </m:e>
+            <m:sub>
+              <m:r>
+                <m:rPr>
+                  <m:nor/>
+                  <m:sty m:val="p"/>
+                </m:rPr>
+                <m:t>корр</m:t>
+              </m:r>
+            </m:sub>
+          </m:sSub>
+          <m:r>
+            <m:rPr>
+              <m:sty m:val="p"/>
+            </m:rPr>
+            <m:t>+</m:t>
+          </m:r>
+          <m:r>
+            <m:t>0</m:t>
+          </m:r>
+          <m:r>
+            <m:rPr>
+              <m:sty m:val="p"/>
+            </m:rPr>
+            <m:t>,</m:t>
+          </m:r>
+          <m:r>
+            <m:t>15</m:t>
+          </m:r>
+          <m:r>
+            <m:rPr>
+              <m:sty m:val="p"/>
+            </m:rPr>
+            <m:t>⋅</m:t>
+          </m:r>
+          <m:sSub>
+            <m:e>
+              <m:r>
+                <m:t>r</m:t>
+              </m:r>
+            </m:e>
+            <m:sub>
+              <m:r>
+                <m:rPr>
+                  <m:nor/>
+                  <m:sty m:val="p"/>
+                </m:rPr>
+                <m:t>форм</m:t>
+              </m:r>
+            </m:sub>
+          </m:sSub>
+          <m:r>
+            <m:rPr>
+              <m:sty m:val="p"/>
+            </m:rPr>
+            <m:t>+</m:t>
+          </m:r>
+          <m:r>
+            <m:t>0</m:t>
+          </m:r>
+          <m:r>
+            <m:rPr>
+              <m:sty m:val="p"/>
+            </m:rPr>
+            <m:t>,</m:t>
+          </m:r>
+          <m:r>
+            <m:t>15</m:t>
+          </m:r>
+          <m:r>
+            <m:rPr>
+              <m:sty m:val="p"/>
+            </m:rPr>
+            <m:t>⋅</m:t>
+          </m:r>
+          <m:sSub>
+            <m:e>
+              <m:r>
+                <m:t>r</m:t>
+              </m:r>
+            </m:e>
+            <m:sub>
+              <m:r>
+                <m:rPr>
+                  <m:nor/>
+                  <m:sty m:val="p"/>
+                </m:rPr>
+                <m:t>сокр</m:t>
+              </m:r>
+            </m:sub>
+          </m:sSub>
+          <m:r>
+            <m:rPr>
+              <m:sty m:val="p"/>
+            </m:rPr>
+            <m:t>,</m:t>
+          </m:r>
+        </m:oMath>
+      </m:oMathPara>
+    </w:p>
+    <w:p>
+      <w:pPr>
+        <w:pStyle w:val="FirstParagraph"/>
+      </w:pPr>
+      <w:r>
+        <w:t xml:space="preserve">где</w:t>
+      </w:r>
+      <w:r>
+        <w:t xml:space="preserve"> </w:t>
+      </w:r>
+      <m:oMath>
+        <m:sSub>
+          <m:e>
+            <m:r>
+              <m:t>r</m:t>
+            </m:r>
+          </m:e>
+          <m:sub>
+            <m:r>
+              <m:rPr>
+                <m:nor/>
+                <m:sty m:val="p"/>
+              </m:rPr>
+              <m:t>корр</m:t>
+            </m:r>
+          </m:sub>
+        </m:sSub>
+      </m:oMath>
+      <w:r>
+        <w:t xml:space="preserve"> </w:t>
+      </w:r>
+      <w:r>
+        <w:t xml:space="preserve">— бинарная корректность ответа (верификация средствами SymPy для математики и ChemPy для химии),</w:t>
+      </w:r>
+      <w:r>
+        <w:t xml:space="preserve"> </w:t>
+      </w:r>
+      <m:oMath>
+        <m:sSub>
+          <m:e>
+            <m:r>
+              <m:t>r</m:t>
+            </m:r>
+          </m:e>
+          <m:sub>
+            <m:r>
+              <m:rPr>
+                <m:nor/>
+                <m:sty m:val="p"/>
+              </m:rPr>
+              <m:t>форм</m:t>
+            </m:r>
+          </m:sub>
+        </m:sSub>
+      </m:oMath>
+      <w:r>
+        <w:t xml:space="preserve"> </w:t>
+      </w:r>
+      <w:r>
+        <w:t xml:space="preserve">— соответствие требуемому формату ответа,</w:t>
+      </w:r>
+      <w:r>
+        <w:t xml:space="preserve"> </w:t>
+      </w:r>
+      <m:oMath>
+        <m:sSub>
+          <m:e>
+            <m:r>
+              <m:t>r</m:t>
+            </m:r>
+          </m:e>
+          <m:sub>
+            <m:r>
+              <m:rPr>
+                <m:nor/>
+                <m:sty m:val="p"/>
+              </m:rPr>
+              <m:t>сокр</m:t>
+            </m:r>
+          </m:sub>
+        </m:sSub>
+      </m:oMath>
+      <w:r>
+        <w:t xml:space="preserve"> </w:t>
+      </w:r>
+      <w:r>
+        <w:t xml:space="preserve">— оценка сократического стиля (наличие наводящих вопросов вместо прямого решения).</w:t>
+      </w:r>
+    </w:p>
+    <w:p>
+      <w:pPr>
+        <w:pStyle w:val="a7"/>
+      </w:pPr>
+      <w:r>
+        <w:t xml:space="preserve">Ключевым компонентом стадии является</w:t>
+      </w:r>
+      <w:r>
+        <w:t xml:space="preserve"> </w:t>
+      </w:r>
       <w:r>
         <w:rPr>
-          <w:i/>
-          <w:color w:val="808080"/>
+          <w:b/>
+          <w:bCs/>
         </w:rPr>
-        <w:t>[7 оптимизаций, ThinkingBudgetProcessor, гиперпараметры — 3 стр.]</w:t>
+        <w:t xml:space="preserve">ThinkingBudgetProcessor</w:t>
+      </w:r>
+      <w:r>
+        <w:t xml:space="preserve"> </w:t>
+      </w:r>
+      <w:r>
+        <w:t xml:space="preserve">— процессор логитов (LogitsProcessor), гарантирующий завершение фазы рассуждения в пределах заданного бюджета</w:t>
+      </w:r>
+      <w:r>
+        <w:t xml:space="preserve"> </w:t>
+      </w:r>
+      <m:oMath>
+        <m:r>
+          <m:t>B</m:t>
+        </m:r>
+        <m:r>
+          <m:rPr>
+            <m:sty m:val="p"/>
+          </m:rPr>
+          <m:t>=</m:t>
+        </m:r>
+        <m:r>
+          <m:t>1500</m:t>
+        </m:r>
+      </m:oMath>
+      <w:r>
+        <w:t xml:space="preserve"> </w:t>
+      </w:r>
+      <w:r>
+        <w:t xml:space="preserve">токенов. При достижении</w:t>
+      </w:r>
+      <w:r>
+        <w:t xml:space="preserve"> </w:t>
+      </w:r>
+      <m:oMath>
+        <m:r>
+          <m:t>90</m:t>
+        </m:r>
+        <m:r>
+          <m:rPr>
+            <m:sty m:val="p"/>
+          </m:rPr>
+          <m:t>%</m:t>
+        </m:r>
+      </m:oMath>
+      <w:r>
+        <w:t xml:space="preserve"> </w:t>
+      </w:r>
+      <w:r>
+        <w:t xml:space="preserve">бюджета логит закрывающего токена</w:t>
+      </w:r>
+      <w:r>
+        <w:t xml:space="preserve"> </w:t>
+      </w:r>
+      <w:r>
+        <w:rPr>
+          <w:rStyle w:val="VerbatimChar"/>
+        </w:rPr>
+        <w:t xml:space="preserve">&lt;/think&gt;</w:t>
+      </w:r>
+      <w:r>
+        <w:t xml:space="preserve"> </w:t>
+      </w:r>
+      <w:r>
+        <w:t xml:space="preserve">усиливается на фиксированную величину (мягкое подталкивание):</w:t>
+      </w:r>
+    </w:p>
+    <w:p>
+      <w:pPr>
+        <w:pStyle w:val="a7"/>
+      </w:pPr>
+      <m:oMathPara>
+        <m:oMathParaPr>
+          <m:jc m:val="center"/>
+        </m:oMathParaPr>
+        <m:oMath>
+          <m:sSub>
+            <m:e>
+              <m:r>
+                <m:t>ℓ</m:t>
+              </m:r>
+            </m:e>
+            <m:sub>
+              <m:r>
+                <m:rPr>
+                  <m:sty m:val="p"/>
+                </m:rPr>
+                <m:t>⟨</m:t>
+              </m:r>
+              <m:r>
+                <m:rPr>
+                  <m:sty m:val="p"/>
+                </m:rPr>
+                <m:t>/</m:t>
+              </m:r>
+              <m:r>
+                <m:rPr>
+                  <m:nor/>
+                  <m:sty m:val="p"/>
+                </m:rPr>
+                <m:t>think</m:t>
+              </m:r>
+              <m:r>
+                <m:rPr>
+                  <m:sty m:val="p"/>
+                </m:rPr>
+                <m:t>⟩</m:t>
+              </m:r>
+            </m:sub>
+          </m:sSub>
+          <m:r>
+            <m:rPr>
+              <m:sty m:val="p"/>
+            </m:rPr>
+            <m:t>←</m:t>
+          </m:r>
+          <m:sSub>
+            <m:e>
+              <m:r>
+                <m:t>ℓ</m:t>
+              </m:r>
+            </m:e>
+            <m:sub>
+              <m:r>
+                <m:rPr>
+                  <m:sty m:val="p"/>
+                </m:rPr>
+                <m:t>⟨</m:t>
+              </m:r>
+              <m:r>
+                <m:rPr>
+                  <m:sty m:val="p"/>
+                </m:rPr>
+                <m:t>/</m:t>
+              </m:r>
+              <m:r>
+                <m:rPr>
+                  <m:nor/>
+                  <m:sty m:val="p"/>
+                </m:rPr>
+                <m:t>think</m:t>
+              </m:r>
+              <m:r>
+                <m:rPr>
+                  <m:sty m:val="p"/>
+                </m:rPr>
+                <m:t>⟩</m:t>
+              </m:r>
+            </m:sub>
+          </m:sSub>
+          <m:r>
+            <m:rPr>
+              <m:sty m:val="p"/>
+            </m:rPr>
+            <m:t>+</m:t>
+          </m:r>
+          <m:r>
+            <m:t>5</m:t>
+          </m:r>
+          <m:r>
+            <m:rPr>
+              <m:sty m:val="p"/>
+            </m:rPr>
+            <m:t>,</m:t>
+          </m:r>
+          <m:r>
+            <m:t>0</m:t>
+          </m:r>
+          <m:r>
+            <m:t> </m:t>
+          </m:r>
+          <m:r>
+            <m:rPr>
+              <m:nor/>
+              <m:sty m:val="p"/>
+            </m:rPr>
+            <m:t>при</m:t>
+          </m:r>
+          <m:r>
+            <m:t> </m:t>
+          </m:r>
+          <m:r>
+            <m:t>t</m:t>
+          </m:r>
+          <m:r>
+            <m:rPr>
+              <m:sty m:val="p"/>
+            </m:rPr>
+            <m:t>≥</m:t>
+          </m:r>
+          <m:r>
+            <m:t>0</m:t>
+          </m:r>
+          <m:r>
+            <m:rPr>
+              <m:sty m:val="p"/>
+            </m:rPr>
+            <m:t>,</m:t>
+          </m:r>
+          <m:r>
+            <m:t>9</m:t>
+          </m:r>
+          <m:r>
+            <m:t> </m:t>
+          </m:r>
+          <m:r>
+            <m:t>B</m:t>
+          </m:r>
+          <m:r>
+            <m:rPr>
+              <m:sty m:val="p"/>
+            </m:rPr>
+            <m:t>,</m:t>
+          </m:r>
+        </m:oMath>
+      </m:oMathPara>
+    </w:p>
+    <w:p>
+      <w:pPr>
+        <w:pStyle w:val="FirstParagraph"/>
+      </w:pPr>
+      <w:r>
+        <w:t xml:space="preserve">а при исчерпании бюджета (</w:t>
+      </w:r>
+      <m:oMath>
+        <m:r>
+          <m:t>t</m:t>
+        </m:r>
+        <m:r>
+          <m:rPr>
+            <m:sty m:val="p"/>
+          </m:rPr>
+          <m:t>≥</m:t>
+        </m:r>
+        <m:r>
+          <m:t>B</m:t>
+        </m:r>
+      </m:oMath>
+      <w:r>
+        <w:t xml:space="preserve">) логиты всех прочих токенов устанавливаются в</w:t>
+      </w:r>
+      <w:r>
+        <w:t xml:space="preserve"> </w:t>
+      </w:r>
+      <m:oMath>
+        <m:r>
+          <m:rPr>
+            <m:sty m:val="p"/>
+          </m:rPr>
+          <m:t>−</m:t>
+        </m:r>
+        <m:r>
+          <m:rPr>
+            <m:sty m:val="p"/>
+          </m:rPr>
+          <m:t>∞</m:t>
+        </m:r>
+      </m:oMath>
+      <w:r>
+        <w:t xml:space="preserve">, что принудительно завершает рассуждение. Это устраняет проблему неограниченной генерации, при которой</w:t>
+      </w:r>
+      <w:r>
+        <w:t xml:space="preserve"> </w:t>
+      </w:r>
+      <m:oMath>
+        <m:r>
+          <m:t>100</m:t>
+        </m:r>
+        <m:r>
+          <m:rPr>
+            <m:sty m:val="p"/>
+          </m:rPr>
+          <m:t>%</m:t>
+        </m:r>
+      </m:oMath>
+      <w:r>
+        <w:t xml:space="preserve"> </w:t>
+      </w:r>
+      <w:r>
+        <w:t xml:space="preserve">completions обрезались по максимальной длине и получали нулевую награду.</w:t>
+      </w:r>
+    </w:p>
+    <w:p>
+      <w:pPr>
+        <w:pStyle w:val="a7"/>
+      </w:pPr>
+      <w:r>
+        <w:t xml:space="preserve">Для преодоления нулевой дисперсии преимуществ при разреженной бинарной награде применяется дитеринг наград (reward dithering, ReDit): к каждой награде добавляется гауссов шум</w:t>
+      </w:r>
+    </w:p>
+    <w:p>
+      <w:pPr>
+        <w:pStyle w:val="a7"/>
+      </w:pPr>
+      <m:oMathPara>
+        <m:oMathParaPr>
+          <m:jc m:val="center"/>
+        </m:oMathParaPr>
+        <m:oMath>
+          <m:acc>
+            <m:accPr>
+              <m:chr m:val="̃"/>
+            </m:accPr>
+            <m:e>
+              <m:r>
+                <m:t>r</m:t>
+              </m:r>
+            </m:e>
+          </m:acc>
+          <m:r>
+            <m:rPr>
+              <m:sty m:val="p"/>
+            </m:rPr>
+            <m:t>=</m:t>
+          </m:r>
+          <m:r>
+            <m:t>r</m:t>
+          </m:r>
+          <m:r>
+            <m:rPr>
+              <m:sty m:val="p"/>
+            </m:rPr>
+            <m:t>+</m:t>
+          </m:r>
+          <m:r>
+            <m:t>ε</m:t>
+          </m:r>
+          <m:r>
+            <m:rPr>
+              <m:sty m:val="p"/>
+            </m:rPr>
+            <m:t>,</m:t>
+          </m:r>
+          <m:r>
+            <m:t> </m:t>
+          </m:r>
+          <m:r>
+            <m:t>ε</m:t>
+          </m:r>
+          <m:r>
+            <m:rPr>
+              <m:sty m:val="p"/>
+            </m:rPr>
+            <m:t>∼</m:t>
+          </m:r>
+          <m:r>
+            <m:rPr>
+              <m:scr m:val="script"/>
+              <m:sty m:val="p"/>
+            </m:rPr>
+            <m:t>N</m:t>
+          </m:r>
+          <m:r>
+            <m:rPr>
+              <m:sty m:val="p"/>
+            </m:rPr>
+            <m:t>(</m:t>
+          </m:r>
+          <m:r>
+            <m:t>0</m:t>
+          </m:r>
+          <m:r>
+            <m:rPr>
+              <m:sty m:val="p"/>
+            </m:rPr>
+            <m:t>;</m:t>
+          </m:r>
+          <m:r>
+            <m:t> </m:t>
+          </m:r>
+          <m:r>
+            <m:t>0</m:t>
+          </m:r>
+          <m:r>
+            <m:rPr>
+              <m:sty m:val="p"/>
+            </m:rPr>
+            <m:t>,</m:t>
+          </m:r>
+          <m:sSup>
+            <m:e>
+              <m:r>
+                <m:t>05</m:t>
+              </m:r>
+            </m:e>
+            <m:sup>
+              <m:r>
+                <m:t>2</m:t>
+              </m:r>
+            </m:sup>
+          </m:sSup>
+          <m:r>
+            <m:rPr>
+              <m:sty m:val="p"/>
+            </m:rPr>
+            <m:t>)</m:t>
+          </m:r>
+          <m:r>
+            <m:rPr>
+              <m:sty m:val="p"/>
+            </m:rPr>
+            <m:t>,</m:t>
+          </m:r>
+        </m:oMath>
+      </m:oMathPara>
+    </w:p>
+    <w:p>
+      <w:pPr>
+        <w:pStyle w:val="FirstParagraph"/>
+      </w:pPr>
+      <w:r>
+        <w:t xml:space="preserve">что формирует непрерывный ландшафт и обеспечивает ненулевой градиент даже для групп с одинаковой исходной наградой.</w:t>
+      </w:r>
+    </w:p>
+    <w:p>
+      <w:pPr>
+        <w:pStyle w:val="a7"/>
+      </w:pPr>
+      <w:r>
+        <w:t xml:space="preserve">Гиперпараметры стадии: адаптеры LoRA ранга</w:t>
+      </w:r>
+      <w:r>
+        <w:t xml:space="preserve"> </w:t>
+      </w:r>
+      <m:oMath>
+        <m:r>
+          <m:t>r</m:t>
+        </m:r>
+        <m:r>
+          <m:rPr>
+            <m:sty m:val="p"/>
+          </m:rPr>
+          <m:t>=</m:t>
+        </m:r>
+        <m:r>
+          <m:t>16</m:t>
+        </m:r>
+      </m:oMath>
+      <w:r>
+        <w:t xml:space="preserve"> </w:t>
+      </w:r>
+      <w:r>
+        <w:t xml:space="preserve">и</w:t>
+      </w:r>
+      <w:r>
+        <w:t xml:space="preserve"> </w:t>
+      </w:r>
+      <m:oMath>
+        <m:r>
+          <m:t>α</m:t>
+        </m:r>
+        <m:r>
+          <m:rPr>
+            <m:sty m:val="p"/>
+          </m:rPr>
+          <m:t>=</m:t>
+        </m:r>
+        <m:r>
+          <m:t>32</m:t>
+        </m:r>
+      </m:oMath>
+      <w:r>
+        <w:t xml:space="preserve">, скорость обучения</w:t>
+      </w:r>
+      <w:r>
+        <w:t xml:space="preserve"> </w:t>
+      </w:r>
+      <m:oMath>
+        <m:r>
+          <m:t>5</m:t>
+        </m:r>
+        <m:r>
+          <m:rPr>
+            <m:sty m:val="p"/>
+          </m:rPr>
+          <m:t>⋅</m:t>
+        </m:r>
+        <m:sSup>
+          <m:e>
+            <m:r>
+              <m:t>10</m:t>
+            </m:r>
+          </m:e>
+          <m:sup>
+            <m:r>
+              <m:rPr>
+                <m:sty m:val="p"/>
+              </m:rPr>
+              <m:t>−</m:t>
+            </m:r>
+            <m:r>
+              <m:t>7</m:t>
+            </m:r>
+          </m:sup>
+        </m:sSup>
+      </m:oMath>
+      <w:r>
+        <w:t xml:space="preserve">, размер группы</w:t>
+      </w:r>
+      <w:r>
+        <w:t xml:space="preserve"> </w:t>
+      </w:r>
+      <m:oMath>
+        <m:r>
+          <m:t>G</m:t>
+        </m:r>
+        <m:r>
+          <m:rPr>
+            <m:sty m:val="p"/>
+          </m:rPr>
+          <m:t>=</m:t>
+        </m:r>
+        <m:r>
+          <m:t>8</m:t>
+        </m:r>
+      </m:oMath>
+      <w:r>
+        <w:t xml:space="preserve">, максимальная длина completion 2048 токенов, бюджет рассуждения 1500 токенов. Чекпойнт стадии публикуется в репозитории HuggingFace Hub</w:t>
+      </w:r>
+      <w:r>
+        <w:t xml:space="preserve"> </w:t>
+      </w:r>
+      <w:r>
+        <w:rPr>
+          <w:rStyle w:val="VerbatimChar"/>
+        </w:rPr>
+        <w:t xml:space="preserve">Siesher/mits-qwen3-9b-gspo</w:t>
+      </w:r>
+      <w:r>
+        <w:t xml:space="preserve">.</w:t>
       </w:r>
     </w:p>
     <w:p>

</xml_diff>